<commit_message>
: IBM cloud API
</commit_message>
<xml_diff>
--- a/IBM Cloud/Introduction to API Development in IBM Cloud.docx
+++ b/IBM Cloud/Introduction to API Development in IBM Cloud.docx
@@ -33,6 +33,17 @@
           <w:szCs w:val="24"/>
         </w:rPr>
       </w:pPr>
+    </w:p>
+    <w:p>
+      <w:pPr>
+        <w:rPr>
+          <w:rFonts w:ascii="Times New Roman" w:hAnsi="Times New Roman" w:cs="Times New Roman"/>
+          <w:b/>
+          <w:bCs/>
+          <w:sz w:val="24"/>
+          <w:szCs w:val="24"/>
+        </w:rPr>
+      </w:pPr>
       <w:r>
         <w:rPr>
           <w:rFonts w:ascii="Times New Roman" w:hAnsi="Times New Roman" w:cs="Times New Roman"/>
@@ -60,6 +71,23 @@
         </w:rPr>
         <w:br/>
         <w:t>Application Programming Interfaces (APIs) enable seamless communication between different software applications, systems, or services.</w:t>
+      </w:r>
+    </w:p>
+    <w:p>
+      <w:pPr>
+        <w:rPr>
+          <w:rFonts w:ascii="Times New Roman" w:hAnsi="Times New Roman" w:cs="Times New Roman"/>
+          <w:sz w:val="24"/>
+          <w:szCs w:val="24"/>
+        </w:rPr>
+      </w:pPr>
+      <w:r>
+        <w:rPr>
+          <w:rFonts w:ascii="Times New Roman" w:hAnsi="Times New Roman" w:cs="Times New Roman"/>
+          <w:sz w:val="24"/>
+          <w:szCs w:val="24"/>
+        </w:rPr>
+        <w:t>\</w:t>
       </w:r>
     </w:p>
     <w:p>
@@ -414,6 +442,454 @@
         </w:rPr>
         <w:t xml:space="preserve"> Maintain multiple versions of an API to ensure backward compatibility and smooth transitions.</w:t>
       </w:r>
+    </w:p>
+    <w:p>
+      <w:pPr>
+        <w:rPr>
+          <w:rFonts w:ascii="Times New Roman" w:hAnsi="Times New Roman" w:cs="Times New Roman"/>
+          <w:sz w:val="24"/>
+          <w:szCs w:val="24"/>
+        </w:rPr>
+      </w:pPr>
+    </w:p>
+    <w:p>
+      <w:pPr>
+        <w:rPr>
+          <w:rFonts w:ascii="Times New Roman" w:hAnsi="Times New Roman" w:cs="Times New Roman"/>
+          <w:b/>
+          <w:bCs/>
+          <w:sz w:val="24"/>
+          <w:szCs w:val="24"/>
+        </w:rPr>
+      </w:pPr>
+      <w:r>
+        <w:rPr>
+          <w:rFonts w:ascii="Times New Roman" w:hAnsi="Times New Roman" w:cs="Times New Roman"/>
+          <w:b/>
+          <w:bCs/>
+          <w:sz w:val="24"/>
+          <w:szCs w:val="24"/>
+        </w:rPr>
+        <w:t>Introduction to IBM API Connect</w:t>
+      </w:r>
+    </w:p>
+    <w:p>
+      <w:pPr>
+        <w:rPr>
+          <w:rFonts w:ascii="Times New Roman" w:hAnsi="Times New Roman" w:cs="Times New Roman"/>
+          <w:sz w:val="24"/>
+          <w:szCs w:val="24"/>
+        </w:rPr>
+      </w:pPr>
+      <w:r>
+        <w:rPr>
+          <w:rFonts w:ascii="Times New Roman" w:hAnsi="Times New Roman" w:cs="Times New Roman"/>
+          <w:b/>
+          <w:bCs/>
+          <w:sz w:val="24"/>
+          <w:szCs w:val="24"/>
+        </w:rPr>
+        <w:t>What is IBM API Connect?</w:t>
+      </w:r>
+      <w:r>
+        <w:rPr>
+          <w:rFonts w:ascii="Times New Roman" w:hAnsi="Times New Roman" w:cs="Times New Roman"/>
+          <w:sz w:val="24"/>
+          <w:szCs w:val="24"/>
+        </w:rPr>
+        <w:br/>
+        <w:t xml:space="preserve">IBM API Connect is a full lifecycle API management platform that helps in creating, managing, securing, and </w:t>
+      </w:r>
+      <w:proofErr w:type="spellStart"/>
+      <w:r>
+        <w:rPr>
+          <w:rFonts w:ascii="Times New Roman" w:hAnsi="Times New Roman" w:cs="Times New Roman"/>
+          <w:sz w:val="24"/>
+          <w:szCs w:val="24"/>
+        </w:rPr>
+        <w:t>analyzing</w:t>
+      </w:r>
+      <w:proofErr w:type="spellEnd"/>
+      <w:r>
+        <w:rPr>
+          <w:rFonts w:ascii="Times New Roman" w:hAnsi="Times New Roman" w:cs="Times New Roman"/>
+          <w:sz w:val="24"/>
+          <w:szCs w:val="24"/>
+        </w:rPr>
+        <w:t xml:space="preserve"> APIs efficiently.</w:t>
+      </w:r>
+    </w:p>
+    <w:p>
+      <w:pPr>
+        <w:rPr>
+          <w:rFonts w:ascii="Times New Roman" w:hAnsi="Times New Roman" w:cs="Times New Roman"/>
+          <w:sz w:val="24"/>
+          <w:szCs w:val="24"/>
+        </w:rPr>
+      </w:pPr>
+    </w:p>
+    <w:p>
+      <w:pPr>
+        <w:rPr>
+          <w:rFonts w:ascii="Times New Roman" w:hAnsi="Times New Roman" w:cs="Times New Roman"/>
+          <w:b/>
+          <w:bCs/>
+          <w:sz w:val="24"/>
+          <w:szCs w:val="24"/>
+        </w:rPr>
+      </w:pPr>
+      <w:r>
+        <w:rPr>
+          <w:rFonts w:ascii="Times New Roman" w:hAnsi="Times New Roman" w:cs="Times New Roman"/>
+          <w:b/>
+          <w:bCs/>
+          <w:sz w:val="24"/>
+          <w:szCs w:val="24"/>
+        </w:rPr>
+        <w:t>Key Features</w:t>
+      </w:r>
+    </w:p>
+    <w:p>
+      <w:pPr>
+        <w:numPr>
+          <w:ilvl w:val="0"/>
+          <w:numId w:val="2"/>
+        </w:numPr>
+        <w:rPr>
+          <w:rFonts w:ascii="Times New Roman" w:hAnsi="Times New Roman" w:cs="Times New Roman"/>
+          <w:sz w:val="24"/>
+          <w:szCs w:val="24"/>
+        </w:rPr>
+      </w:pPr>
+      <w:r>
+        <w:rPr>
+          <w:rFonts w:ascii="Times New Roman" w:hAnsi="Times New Roman" w:cs="Times New Roman"/>
+          <w:b/>
+          <w:bCs/>
+          <w:sz w:val="24"/>
+          <w:szCs w:val="24"/>
+        </w:rPr>
+        <w:t>API Creation, Testing, and Security Enforcement:</w:t>
+      </w:r>
+      <w:r>
+        <w:rPr>
+          <w:rFonts w:ascii="Times New Roman" w:hAnsi="Times New Roman" w:cs="Times New Roman"/>
+          <w:sz w:val="24"/>
+          <w:szCs w:val="24"/>
+        </w:rPr>
+        <w:br/>
+        <w:t>Build and deploy RESTful APIs with built-in tools for design, testing, and policy enforcement.</w:t>
+      </w:r>
+    </w:p>
+    <w:p>
+      <w:pPr>
+        <w:numPr>
+          <w:ilvl w:val="0"/>
+          <w:numId w:val="2"/>
+        </w:numPr>
+        <w:rPr>
+          <w:rFonts w:ascii="Times New Roman" w:hAnsi="Times New Roman" w:cs="Times New Roman"/>
+          <w:sz w:val="24"/>
+          <w:szCs w:val="24"/>
+        </w:rPr>
+      </w:pPr>
+      <w:r>
+        <w:rPr>
+          <w:rFonts w:ascii="Times New Roman" w:hAnsi="Times New Roman" w:cs="Times New Roman"/>
+          <w:b/>
+          <w:bCs/>
+          <w:sz w:val="24"/>
+          <w:szCs w:val="24"/>
+        </w:rPr>
+        <w:t>Authentication Support (OAuth 2.0 and JWT):</w:t>
+      </w:r>
+      <w:r>
+        <w:rPr>
+          <w:rFonts w:ascii="Times New Roman" w:hAnsi="Times New Roman" w:cs="Times New Roman"/>
+          <w:sz w:val="24"/>
+          <w:szCs w:val="24"/>
+        </w:rPr>
+        <w:br/>
+        <w:t>Secure your APIs using industry-standard protocols like OAuth 2.0 and JSON Web Tokens (JWT).</w:t>
+      </w:r>
+    </w:p>
+    <w:p>
+      <w:pPr>
+        <w:numPr>
+          <w:ilvl w:val="0"/>
+          <w:numId w:val="2"/>
+        </w:numPr>
+        <w:rPr>
+          <w:rFonts w:ascii="Times New Roman" w:hAnsi="Times New Roman" w:cs="Times New Roman"/>
+          <w:sz w:val="24"/>
+          <w:szCs w:val="24"/>
+        </w:rPr>
+      </w:pPr>
+      <w:r>
+        <w:rPr>
+          <w:rFonts w:ascii="Times New Roman" w:hAnsi="Times New Roman" w:cs="Times New Roman"/>
+          <w:b/>
+          <w:bCs/>
+          <w:sz w:val="24"/>
+          <w:szCs w:val="24"/>
+        </w:rPr>
+        <w:lastRenderedPageBreak/>
+        <w:t>Rate Limiting and API Analytics:</w:t>
+      </w:r>
+      <w:r>
+        <w:rPr>
+          <w:rFonts w:ascii="Times New Roman" w:hAnsi="Times New Roman" w:cs="Times New Roman"/>
+          <w:sz w:val="24"/>
+          <w:szCs w:val="24"/>
+        </w:rPr>
+        <w:br/>
+        <w:t>Control API usage with rate limits and gain insights through real-time analytics dashboards.</w:t>
+      </w:r>
+    </w:p>
+    <w:p>
+      <w:pPr>
+        <w:numPr>
+          <w:ilvl w:val="0"/>
+          <w:numId w:val="2"/>
+        </w:numPr>
+        <w:rPr>
+          <w:rFonts w:ascii="Times New Roman" w:hAnsi="Times New Roman" w:cs="Times New Roman"/>
+          <w:sz w:val="24"/>
+          <w:szCs w:val="24"/>
+        </w:rPr>
+      </w:pPr>
+      <w:r>
+        <w:rPr>
+          <w:rFonts w:ascii="Times New Roman" w:hAnsi="Times New Roman" w:cs="Times New Roman"/>
+          <w:b/>
+          <w:bCs/>
+          <w:sz w:val="24"/>
+          <w:szCs w:val="24"/>
+        </w:rPr>
+        <w:t>API Versioning and Lifecycle Management:</w:t>
+      </w:r>
+      <w:r>
+        <w:rPr>
+          <w:rFonts w:ascii="Times New Roman" w:hAnsi="Times New Roman" w:cs="Times New Roman"/>
+          <w:sz w:val="24"/>
+          <w:szCs w:val="24"/>
+        </w:rPr>
+        <w:br/>
+        <w:t>Manage multiple versions of APIs and control their lifecycle from development to retirement.</w:t>
+      </w:r>
+    </w:p>
+    <w:p>
+      <w:pPr>
+        <w:rPr>
+          <w:rFonts w:ascii="Times New Roman" w:hAnsi="Times New Roman" w:cs="Times New Roman"/>
+          <w:sz w:val="24"/>
+          <w:szCs w:val="24"/>
+        </w:rPr>
+      </w:pPr>
+    </w:p>
+    <w:p>
+      <w:pPr>
+        <w:rPr>
+          <w:rFonts w:ascii="Times New Roman" w:hAnsi="Times New Roman" w:cs="Times New Roman"/>
+          <w:b/>
+          <w:bCs/>
+          <w:sz w:val="24"/>
+          <w:szCs w:val="24"/>
+        </w:rPr>
+      </w:pPr>
+      <w:r>
+        <w:rPr>
+          <w:rFonts w:ascii="Times New Roman" w:hAnsi="Times New Roman" w:cs="Times New Roman"/>
+          <w:b/>
+          <w:bCs/>
+          <w:sz w:val="24"/>
+          <w:szCs w:val="24"/>
+        </w:rPr>
+        <w:t>Use Cases</w:t>
+      </w:r>
+    </w:p>
+    <w:p>
+      <w:pPr>
+        <w:numPr>
+          <w:ilvl w:val="0"/>
+          <w:numId w:val="3"/>
+        </w:numPr>
+        <w:rPr>
+          <w:rFonts w:ascii="Times New Roman" w:hAnsi="Times New Roman" w:cs="Times New Roman"/>
+          <w:sz w:val="24"/>
+          <w:szCs w:val="24"/>
+        </w:rPr>
+      </w:pPr>
+      <w:r>
+        <w:rPr>
+          <w:rFonts w:ascii="Times New Roman" w:hAnsi="Times New Roman" w:cs="Times New Roman"/>
+          <w:b/>
+          <w:bCs/>
+          <w:sz w:val="24"/>
+          <w:szCs w:val="24"/>
+        </w:rPr>
+        <w:t>Exposing Microservices Securely:</w:t>
+      </w:r>
+      <w:r>
+        <w:rPr>
+          <w:rFonts w:ascii="Times New Roman" w:hAnsi="Times New Roman" w:cs="Times New Roman"/>
+          <w:sz w:val="24"/>
+          <w:szCs w:val="24"/>
+        </w:rPr>
+        <w:br/>
+        <w:t>Wrap internal microservices as secure APIs for external or internal consumption.</w:t>
+      </w:r>
+    </w:p>
+    <w:p>
+      <w:pPr>
+        <w:numPr>
+          <w:ilvl w:val="0"/>
+          <w:numId w:val="3"/>
+        </w:numPr>
+        <w:rPr>
+          <w:rFonts w:ascii="Times New Roman" w:hAnsi="Times New Roman" w:cs="Times New Roman"/>
+          <w:sz w:val="24"/>
+          <w:szCs w:val="24"/>
+        </w:rPr>
+      </w:pPr>
+      <w:r>
+        <w:rPr>
+          <w:rFonts w:ascii="Times New Roman" w:hAnsi="Times New Roman" w:cs="Times New Roman"/>
+          <w:b/>
+          <w:bCs/>
+          <w:sz w:val="24"/>
+          <w:szCs w:val="24"/>
+        </w:rPr>
+        <w:t>Managing Third-Party API Access:</w:t>
+      </w:r>
+      <w:r>
+        <w:rPr>
+          <w:rFonts w:ascii="Times New Roman" w:hAnsi="Times New Roman" w:cs="Times New Roman"/>
+          <w:sz w:val="24"/>
+          <w:szCs w:val="24"/>
+        </w:rPr>
+        <w:br/>
+        <w:t>Enable controlled and secure access for partners, developers, or external systems.</w:t>
+      </w:r>
+    </w:p>
+    <w:p>
+      <w:pPr>
+        <w:numPr>
+          <w:ilvl w:val="0"/>
+          <w:numId w:val="3"/>
+        </w:numPr>
+        <w:rPr>
+          <w:rFonts w:ascii="Times New Roman" w:hAnsi="Times New Roman" w:cs="Times New Roman"/>
+          <w:sz w:val="24"/>
+          <w:szCs w:val="24"/>
+        </w:rPr>
+      </w:pPr>
+      <w:r>
+        <w:rPr>
+          <w:rFonts w:ascii="Times New Roman" w:hAnsi="Times New Roman" w:cs="Times New Roman"/>
+          <w:b/>
+          <w:bCs/>
+          <w:sz w:val="24"/>
+          <w:szCs w:val="24"/>
+        </w:rPr>
+        <w:t>Automating API Documentation:</w:t>
+      </w:r>
+      <w:r>
+        <w:rPr>
+          <w:rFonts w:ascii="Times New Roman" w:hAnsi="Times New Roman" w:cs="Times New Roman"/>
+          <w:sz w:val="24"/>
+          <w:szCs w:val="24"/>
+        </w:rPr>
+        <w:br/>
+        <w:t xml:space="preserve">Generate and maintain documentation automatically using </w:t>
+      </w:r>
+      <w:proofErr w:type="spellStart"/>
+      <w:r>
+        <w:rPr>
+          <w:rFonts w:ascii="Times New Roman" w:hAnsi="Times New Roman" w:cs="Times New Roman"/>
+          <w:sz w:val="24"/>
+          <w:szCs w:val="24"/>
+        </w:rPr>
+        <w:t>OpenAPI</w:t>
+      </w:r>
+      <w:proofErr w:type="spellEnd"/>
+      <w:r>
+        <w:rPr>
+          <w:rFonts w:ascii="Times New Roman" w:hAnsi="Times New Roman" w:cs="Times New Roman"/>
+          <w:sz w:val="24"/>
+          <w:szCs w:val="24"/>
+        </w:rPr>
+        <w:t xml:space="preserve"> specifications.</w:t>
+      </w:r>
+    </w:p>
+    <w:p>
+      <w:pPr>
+        <w:rPr>
+          <w:rFonts w:ascii="Times New Roman" w:hAnsi="Times New Roman" w:cs="Times New Roman"/>
+          <w:sz w:val="24"/>
+          <w:szCs w:val="24"/>
+        </w:rPr>
+      </w:pPr>
+      <w:r>
+        <w:rPr>
+          <w:rFonts w:ascii="Times New Roman" w:hAnsi="Times New Roman" w:cs="Times New Roman"/>
+          <w:sz w:val="24"/>
+          <w:szCs w:val="24"/>
+        </w:rPr>
+        <w:drawing>
+          <wp:inline distT="0" distB="0" distL="0" distR="0" wp14:anchorId="3213755A" wp14:editId="559C7742">
+            <wp:extent cx="6645910" cy="4437380"/>
+            <wp:effectExtent l="0" t="0" r="2540" b="1270"/>
+            <wp:docPr id="1340758386" name="Picture 1"/>
+            <wp:cNvGraphicFramePr>
+              <a:graphicFrameLocks xmlns:a="http://schemas.openxmlformats.org/drawingml/2006/main" noChangeAspect="1"/>
+            </wp:cNvGraphicFramePr>
+            <a:graphic xmlns:a="http://schemas.openxmlformats.org/drawingml/2006/main">
+              <a:graphicData uri="http://schemas.openxmlformats.org/drawingml/2006/picture">
+                <pic:pic xmlns:pic="http://schemas.openxmlformats.org/drawingml/2006/picture">
+                  <pic:nvPicPr>
+                    <pic:cNvPr id="1340758386" name=""/>
+                    <pic:cNvPicPr/>
+                  </pic:nvPicPr>
+                  <pic:blipFill>
+                    <a:blip r:embed="rId5"/>
+                    <a:stretch>
+                      <a:fillRect/>
+                    </a:stretch>
+                  </pic:blipFill>
+                  <pic:spPr>
+                    <a:xfrm>
+                      <a:off x="0" y="0"/>
+                      <a:ext cx="6645910" cy="4437380"/>
+                    </a:xfrm>
+                    <a:prstGeom prst="rect">
+                      <a:avLst/>
+                    </a:prstGeom>
+                  </pic:spPr>
+                </pic:pic>
+              </a:graphicData>
+            </a:graphic>
+          </wp:inline>
+        </w:drawing>
+      </w:r>
+    </w:p>
+    <w:p>
+      <w:pPr>
+        <w:rPr>
+          <w:rFonts w:ascii="Times New Roman" w:hAnsi="Times New Roman" w:cs="Times New Roman"/>
+          <w:sz w:val="24"/>
+          <w:szCs w:val="24"/>
+        </w:rPr>
+      </w:pPr>
+    </w:p>
+    <w:p>
+      <w:pPr>
+        <w:rPr>
+          <w:rFonts w:ascii="Times New Roman" w:hAnsi="Times New Roman" w:cs="Times New Roman"/>
+          <w:sz w:val="24"/>
+          <w:szCs w:val="24"/>
+        </w:rPr>
+      </w:pPr>
     </w:p>
     <w:p>
       <w:pPr>
@@ -437,6 +913,304 @@
 <file path=word/numbering.xml><?xml version="1.0" encoding="utf-8"?>
 <w:numbering xmlns:wpc="http://schemas.microsoft.com/office/word/2010/wordprocessingCanvas" xmlns:cx="http://schemas.microsoft.com/office/drawing/2014/chartex" xmlns:cx1="http://schemas.microsoft.com/office/drawing/2015/9/8/chartex" xmlns:cx2="http://schemas.microsoft.com/office/drawing/2015/10/21/chartex" xmlns:cx3="http://schemas.microsoft.com/office/drawing/2016/5/9/chartex" xmlns:cx4="http://schemas.microsoft.com/office/drawing/2016/5/10/chartex" xmlns:cx5="http://schemas.microsoft.com/office/drawing/2016/5/11/chartex" xmlns:cx6="http://schemas.microsoft.com/office/drawing/2016/5/12/chartex" xmlns:cx7="http://schemas.microsoft.com/office/drawing/2016/5/13/chartex" xmlns:cx8="http://schemas.microsoft.com/office/drawing/2016/5/14/chartex" xmlns:mc="http://schemas.openxmlformats.org/markup-compatibility/2006" xmlns:aink="http://schemas.microsoft.com/office/drawing/2016/ink" xmlns:am3d="http://schemas.microsoft.com/office/drawing/2017/model3d" xmlns:o="urn:schemas-microsoft-com:office:office" xmlns:oel="http://schemas.microsoft.com/office/2019/extlst" xmlns:r="http://schemas.openxmlformats.org/officeDocument/2006/relationships" xmlns:m="http://schemas.openxmlformats.org/officeDocument/2006/math" xmlns:v="urn:schemas-microsoft-com:vml" xmlns:wp14="http://schemas.microsoft.com/office/word/2010/wordprocessingDrawing" xmlns:wp="http://schemas.openxmlformats.org/drawingml/2006/wordprocessingDrawing" xmlns:w10="urn:schemas-microsoft-com:office:word" xmlns:w="http://schemas.openxmlformats.org/wordprocessingml/2006/main" xmlns:w14="http://schemas.microsoft.com/office/word/2010/wordml" xmlns:w15="http://schemas.microsoft.com/office/word/2012/wordml" xmlns:w16cex="http://schemas.microsoft.com/office/word/2018/wordml/cex" xmlns:w16cid="http://schemas.microsoft.com/office/word/2016/wordml/cid" xmlns:w16="http://schemas.microsoft.com/office/word/2018/wordml" xmlns:w16du="http://schemas.microsoft.com/office/word/2023/wordml/word16du" xmlns:w16sdtdh="http://schemas.microsoft.com/office/word/2020/wordml/sdtdatahash" xmlns:w16sdtfl="http://schemas.microsoft.com/office/word/2024/wordml/sdtformatlock" xmlns:w16se="http://schemas.microsoft.com/office/word/2015/wordml/symex" xmlns:wpg="http://schemas.microsoft.com/office/word/2010/wordprocessingGroup" xmlns:wpi="http://schemas.microsoft.com/office/word/2010/wordprocessingInk" xmlns:wne="http://schemas.microsoft.com/office/word/2006/wordml" xmlns:wps="http://schemas.microsoft.com/office/word/2010/wordprocessingShape" mc:Ignorable="w14 w15 w16se w16cid w16 w16cex w16sdtdh w16sdtfl w16du wp14">
   <w:abstractNum w:abstractNumId="0" w15:restartNumberingAfterBreak="0">
+    <w:nsid w:val="25DC1D8B"/>
+    <w:multiLevelType w:val="multilevel"/>
+    <w:tmpl w:val="4DB8F4DE"/>
+    <w:lvl w:ilvl="0">
+      <w:start w:val="1"/>
+      <w:numFmt w:val="bullet"/>
+      <w:lvlText w:val=""/>
+      <w:lvlJc w:val="left"/>
+      <w:pPr>
+        <w:tabs>
+          <w:tab w:val="num" w:pos="720"/>
+        </w:tabs>
+        <w:ind w:left="720" w:hanging="360"/>
+      </w:pPr>
+      <w:rPr>
+        <w:rFonts w:ascii="Symbol" w:hAnsi="Symbol" w:hint="default"/>
+        <w:sz w:val="20"/>
+      </w:rPr>
+    </w:lvl>
+    <w:lvl w:ilvl="1" w:tentative="1">
+      <w:start w:val="1"/>
+      <w:numFmt w:val="bullet"/>
+      <w:lvlText w:val="o"/>
+      <w:lvlJc w:val="left"/>
+      <w:pPr>
+        <w:tabs>
+          <w:tab w:val="num" w:pos="1440"/>
+        </w:tabs>
+        <w:ind w:left="1440" w:hanging="360"/>
+      </w:pPr>
+      <w:rPr>
+        <w:rFonts w:ascii="Courier New" w:hAnsi="Courier New" w:hint="default"/>
+        <w:sz w:val="20"/>
+      </w:rPr>
+    </w:lvl>
+    <w:lvl w:ilvl="2" w:tentative="1">
+      <w:start w:val="1"/>
+      <w:numFmt w:val="bullet"/>
+      <w:lvlText w:val=""/>
+      <w:lvlJc w:val="left"/>
+      <w:pPr>
+        <w:tabs>
+          <w:tab w:val="num" w:pos="2160"/>
+        </w:tabs>
+        <w:ind w:left="2160" w:hanging="360"/>
+      </w:pPr>
+      <w:rPr>
+        <w:rFonts w:ascii="Wingdings" w:hAnsi="Wingdings" w:hint="default"/>
+        <w:sz w:val="20"/>
+      </w:rPr>
+    </w:lvl>
+    <w:lvl w:ilvl="3" w:tentative="1">
+      <w:start w:val="1"/>
+      <w:numFmt w:val="bullet"/>
+      <w:lvlText w:val=""/>
+      <w:lvlJc w:val="left"/>
+      <w:pPr>
+        <w:tabs>
+          <w:tab w:val="num" w:pos="2880"/>
+        </w:tabs>
+        <w:ind w:left="2880" w:hanging="360"/>
+      </w:pPr>
+      <w:rPr>
+        <w:rFonts w:ascii="Wingdings" w:hAnsi="Wingdings" w:hint="default"/>
+        <w:sz w:val="20"/>
+      </w:rPr>
+    </w:lvl>
+    <w:lvl w:ilvl="4" w:tentative="1">
+      <w:start w:val="1"/>
+      <w:numFmt w:val="bullet"/>
+      <w:lvlText w:val=""/>
+      <w:lvlJc w:val="left"/>
+      <w:pPr>
+        <w:tabs>
+          <w:tab w:val="num" w:pos="3600"/>
+        </w:tabs>
+        <w:ind w:left="3600" w:hanging="360"/>
+      </w:pPr>
+      <w:rPr>
+        <w:rFonts w:ascii="Wingdings" w:hAnsi="Wingdings" w:hint="default"/>
+        <w:sz w:val="20"/>
+      </w:rPr>
+    </w:lvl>
+    <w:lvl w:ilvl="5" w:tentative="1">
+      <w:start w:val="1"/>
+      <w:numFmt w:val="bullet"/>
+      <w:lvlText w:val=""/>
+      <w:lvlJc w:val="left"/>
+      <w:pPr>
+        <w:tabs>
+          <w:tab w:val="num" w:pos="4320"/>
+        </w:tabs>
+        <w:ind w:left="4320" w:hanging="360"/>
+      </w:pPr>
+      <w:rPr>
+        <w:rFonts w:ascii="Wingdings" w:hAnsi="Wingdings" w:hint="default"/>
+        <w:sz w:val="20"/>
+      </w:rPr>
+    </w:lvl>
+    <w:lvl w:ilvl="6" w:tentative="1">
+      <w:start w:val="1"/>
+      <w:numFmt w:val="bullet"/>
+      <w:lvlText w:val=""/>
+      <w:lvlJc w:val="left"/>
+      <w:pPr>
+        <w:tabs>
+          <w:tab w:val="num" w:pos="5040"/>
+        </w:tabs>
+        <w:ind w:left="5040" w:hanging="360"/>
+      </w:pPr>
+      <w:rPr>
+        <w:rFonts w:ascii="Wingdings" w:hAnsi="Wingdings" w:hint="default"/>
+        <w:sz w:val="20"/>
+      </w:rPr>
+    </w:lvl>
+    <w:lvl w:ilvl="7" w:tentative="1">
+      <w:start w:val="1"/>
+      <w:numFmt w:val="bullet"/>
+      <w:lvlText w:val=""/>
+      <w:lvlJc w:val="left"/>
+      <w:pPr>
+        <w:tabs>
+          <w:tab w:val="num" w:pos="5760"/>
+        </w:tabs>
+        <w:ind w:left="5760" w:hanging="360"/>
+      </w:pPr>
+      <w:rPr>
+        <w:rFonts w:ascii="Wingdings" w:hAnsi="Wingdings" w:hint="default"/>
+        <w:sz w:val="20"/>
+      </w:rPr>
+    </w:lvl>
+    <w:lvl w:ilvl="8" w:tentative="1">
+      <w:start w:val="1"/>
+      <w:numFmt w:val="bullet"/>
+      <w:lvlText w:val=""/>
+      <w:lvlJc w:val="left"/>
+      <w:pPr>
+        <w:tabs>
+          <w:tab w:val="num" w:pos="6480"/>
+        </w:tabs>
+        <w:ind w:left="6480" w:hanging="360"/>
+      </w:pPr>
+      <w:rPr>
+        <w:rFonts w:ascii="Wingdings" w:hAnsi="Wingdings" w:hint="default"/>
+        <w:sz w:val="20"/>
+      </w:rPr>
+    </w:lvl>
+  </w:abstractNum>
+  <w:abstractNum w:abstractNumId="1" w15:restartNumberingAfterBreak="0">
+    <w:nsid w:val="28F86F29"/>
+    <w:multiLevelType w:val="multilevel"/>
+    <w:tmpl w:val="9A62431C"/>
+    <w:lvl w:ilvl="0">
+      <w:start w:val="1"/>
+      <w:numFmt w:val="bullet"/>
+      <w:lvlText w:val=""/>
+      <w:lvlJc w:val="left"/>
+      <w:pPr>
+        <w:tabs>
+          <w:tab w:val="num" w:pos="720"/>
+        </w:tabs>
+        <w:ind w:left="720" w:hanging="360"/>
+      </w:pPr>
+      <w:rPr>
+        <w:rFonts w:ascii="Symbol" w:hAnsi="Symbol" w:hint="default"/>
+        <w:sz w:val="20"/>
+      </w:rPr>
+    </w:lvl>
+    <w:lvl w:ilvl="1" w:tentative="1">
+      <w:start w:val="1"/>
+      <w:numFmt w:val="bullet"/>
+      <w:lvlText w:val="o"/>
+      <w:lvlJc w:val="left"/>
+      <w:pPr>
+        <w:tabs>
+          <w:tab w:val="num" w:pos="1440"/>
+        </w:tabs>
+        <w:ind w:left="1440" w:hanging="360"/>
+      </w:pPr>
+      <w:rPr>
+        <w:rFonts w:ascii="Courier New" w:hAnsi="Courier New" w:hint="default"/>
+        <w:sz w:val="20"/>
+      </w:rPr>
+    </w:lvl>
+    <w:lvl w:ilvl="2" w:tentative="1">
+      <w:start w:val="1"/>
+      <w:numFmt w:val="bullet"/>
+      <w:lvlText w:val=""/>
+      <w:lvlJc w:val="left"/>
+      <w:pPr>
+        <w:tabs>
+          <w:tab w:val="num" w:pos="2160"/>
+        </w:tabs>
+        <w:ind w:left="2160" w:hanging="360"/>
+      </w:pPr>
+      <w:rPr>
+        <w:rFonts w:ascii="Wingdings" w:hAnsi="Wingdings" w:hint="default"/>
+        <w:sz w:val="20"/>
+      </w:rPr>
+    </w:lvl>
+    <w:lvl w:ilvl="3" w:tentative="1">
+      <w:start w:val="1"/>
+      <w:numFmt w:val="bullet"/>
+      <w:lvlText w:val=""/>
+      <w:lvlJc w:val="left"/>
+      <w:pPr>
+        <w:tabs>
+          <w:tab w:val="num" w:pos="2880"/>
+        </w:tabs>
+        <w:ind w:left="2880" w:hanging="360"/>
+      </w:pPr>
+      <w:rPr>
+        <w:rFonts w:ascii="Wingdings" w:hAnsi="Wingdings" w:hint="default"/>
+        <w:sz w:val="20"/>
+      </w:rPr>
+    </w:lvl>
+    <w:lvl w:ilvl="4" w:tentative="1">
+      <w:start w:val="1"/>
+      <w:numFmt w:val="bullet"/>
+      <w:lvlText w:val=""/>
+      <w:lvlJc w:val="left"/>
+      <w:pPr>
+        <w:tabs>
+          <w:tab w:val="num" w:pos="3600"/>
+        </w:tabs>
+        <w:ind w:left="3600" w:hanging="360"/>
+      </w:pPr>
+      <w:rPr>
+        <w:rFonts w:ascii="Wingdings" w:hAnsi="Wingdings" w:hint="default"/>
+        <w:sz w:val="20"/>
+      </w:rPr>
+    </w:lvl>
+    <w:lvl w:ilvl="5" w:tentative="1">
+      <w:start w:val="1"/>
+      <w:numFmt w:val="bullet"/>
+      <w:lvlText w:val=""/>
+      <w:lvlJc w:val="left"/>
+      <w:pPr>
+        <w:tabs>
+          <w:tab w:val="num" w:pos="4320"/>
+        </w:tabs>
+        <w:ind w:left="4320" w:hanging="360"/>
+      </w:pPr>
+      <w:rPr>
+        <w:rFonts w:ascii="Wingdings" w:hAnsi="Wingdings" w:hint="default"/>
+        <w:sz w:val="20"/>
+      </w:rPr>
+    </w:lvl>
+    <w:lvl w:ilvl="6" w:tentative="1">
+      <w:start w:val="1"/>
+      <w:numFmt w:val="bullet"/>
+      <w:lvlText w:val=""/>
+      <w:lvlJc w:val="left"/>
+      <w:pPr>
+        <w:tabs>
+          <w:tab w:val="num" w:pos="5040"/>
+        </w:tabs>
+        <w:ind w:left="5040" w:hanging="360"/>
+      </w:pPr>
+      <w:rPr>
+        <w:rFonts w:ascii="Wingdings" w:hAnsi="Wingdings" w:hint="default"/>
+        <w:sz w:val="20"/>
+      </w:rPr>
+    </w:lvl>
+    <w:lvl w:ilvl="7" w:tentative="1">
+      <w:start w:val="1"/>
+      <w:numFmt w:val="bullet"/>
+      <w:lvlText w:val=""/>
+      <w:lvlJc w:val="left"/>
+      <w:pPr>
+        <w:tabs>
+          <w:tab w:val="num" w:pos="5760"/>
+        </w:tabs>
+        <w:ind w:left="5760" w:hanging="360"/>
+      </w:pPr>
+      <w:rPr>
+        <w:rFonts w:ascii="Wingdings" w:hAnsi="Wingdings" w:hint="default"/>
+        <w:sz w:val="20"/>
+      </w:rPr>
+    </w:lvl>
+    <w:lvl w:ilvl="8" w:tentative="1">
+      <w:start w:val="1"/>
+      <w:numFmt w:val="bullet"/>
+      <w:lvlText w:val=""/>
+      <w:lvlJc w:val="left"/>
+      <w:pPr>
+        <w:tabs>
+          <w:tab w:val="num" w:pos="6480"/>
+        </w:tabs>
+        <w:ind w:left="6480" w:hanging="360"/>
+      </w:pPr>
+      <w:rPr>
+        <w:rFonts w:ascii="Wingdings" w:hAnsi="Wingdings" w:hint="default"/>
+        <w:sz w:val="20"/>
+      </w:rPr>
+    </w:lvl>
+  </w:abstractNum>
+  <w:abstractNum w:abstractNumId="2" w15:restartNumberingAfterBreak="0">
     <w:nsid w:val="2A194108"/>
     <w:multiLevelType w:val="multilevel"/>
     <w:tmpl w:val="0DF6D428"/>
@@ -554,7 +1328,13 @@
     </w:lvl>
   </w:abstractNum>
   <w:num w:numId="1" w16cid:durableId="1295215061">
+    <w:abstractNumId w:val="2"/>
+  </w:num>
+  <w:num w:numId="2" w16cid:durableId="1024938979">
     <w:abstractNumId w:val="0"/>
+  </w:num>
+  <w:num w:numId="3" w16cid:durableId="1849557213">
+    <w:abstractNumId w:val="1"/>
   </w:num>
 </w:numbering>
 </file>

</xml_diff>